<commit_message>
Bizim Kavşak: kesilecek binalar ve taşıtlar eklendi
Co-Authored-By: Claude Opus 5.5 <noreply@anthropic.com>
Claude-Session: https://claude.ai/code/session_01J4R1tUSWDh3AnQGWFArwGQ
</commit_message>
<xml_diff>
--- a/pano-trafik-ilk-yardim.docx
+++ b/pano-trafik-ilk-yardim.docx
@@ -923,6 +923,202 @@
         </w:drawing>
       </w:r>
     </w:p>
+    <w:p>
+      <w:pPr>
+        <w:sectPr>
+          <w:pgSz w:w="11906" w:h="16838"/>
+          <w:pgMar w:top="0" w:right="0" w:bottom="0" w:left="0" w:header="0" w:footer="0" w:gutter="0"/>
+          <w:cols w:space="720"/>
+          <w:docGrid w:linePitch="360"/>
+        </w:sectPr>
+      </w:pPr>
+    </w:p>
+    <w:p>
+      <w:pPr>
+        <w:spacing w:after="0" w:before="0"/>
+      </w:pPr>
+      <w:r>
+        <w:drawing>
+          <wp:inline xmlns:a="http://schemas.openxmlformats.org/drawingml/2006/main" xmlns:pic="http://schemas.openxmlformats.org/drawingml/2006/picture">
+            <wp:extent cx="7524000" cy="10656000"/>
+            <wp:docPr id="20" name="Picture 20"/>
+            <wp:cNvGraphicFramePr>
+              <a:graphicFrameLocks noChangeAspect="1"/>
+            </wp:cNvGraphicFramePr>
+            <a:graphic>
+              <a:graphicData uri="http://schemas.openxmlformats.org/drawingml/2006/picture">
+                <pic:pic>
+                  <pic:nvPicPr>
+                    <pic:cNvPr id="0" name="trafik-20-binalar-1.jpg"/>
+                    <pic:cNvPicPr/>
+                  </pic:nvPicPr>
+                  <pic:blipFill>
+                    <a:blip r:embed="rId28"/>
+                    <a:stretch>
+                      <a:fillRect/>
+                    </a:stretch>
+                  </pic:blipFill>
+                  <pic:spPr>
+                    <a:xfrm>
+                      <a:off x="0" y="0"/>
+                      <a:ext cx="7524000" cy="10656000"/>
+                    </a:xfrm>
+                    <a:prstGeom prst="rect"/>
+                  </pic:spPr>
+                </pic:pic>
+              </a:graphicData>
+            </a:graphic>
+          </wp:inline>
+        </w:drawing>
+      </w:r>
+    </w:p>
+    <w:p>
+      <w:pPr>
+        <w:sectPr>
+          <w:pgSz w:w="11906" w:h="16838"/>
+          <w:pgMar w:top="0" w:right="0" w:bottom="0" w:left="0" w:header="0" w:footer="0" w:gutter="0"/>
+          <w:cols w:space="720"/>
+          <w:docGrid w:linePitch="360"/>
+        </w:sectPr>
+      </w:pPr>
+    </w:p>
+    <w:p>
+      <w:pPr>
+        <w:spacing w:after="0" w:before="0"/>
+      </w:pPr>
+      <w:r>
+        <w:drawing>
+          <wp:inline xmlns:a="http://schemas.openxmlformats.org/drawingml/2006/main" xmlns:pic="http://schemas.openxmlformats.org/drawingml/2006/picture">
+            <wp:extent cx="7524000" cy="10656000"/>
+            <wp:docPr id="21" name="Picture 21"/>
+            <wp:cNvGraphicFramePr>
+              <a:graphicFrameLocks noChangeAspect="1"/>
+            </wp:cNvGraphicFramePr>
+            <a:graphic>
+              <a:graphicData uri="http://schemas.openxmlformats.org/drawingml/2006/picture">
+                <pic:pic>
+                  <pic:nvPicPr>
+                    <pic:cNvPr id="0" name="trafik-21-binalar-2.jpg"/>
+                    <pic:cNvPicPr/>
+                  </pic:nvPicPr>
+                  <pic:blipFill>
+                    <a:blip r:embed="rId29"/>
+                    <a:stretch>
+                      <a:fillRect/>
+                    </a:stretch>
+                  </pic:blipFill>
+                  <pic:spPr>
+                    <a:xfrm>
+                      <a:off x="0" y="0"/>
+                      <a:ext cx="7524000" cy="10656000"/>
+                    </a:xfrm>
+                    <a:prstGeom prst="rect"/>
+                  </pic:spPr>
+                </pic:pic>
+              </a:graphicData>
+            </a:graphic>
+          </wp:inline>
+        </w:drawing>
+      </w:r>
+    </w:p>
+    <w:p>
+      <w:pPr>
+        <w:sectPr>
+          <w:pgSz w:w="11906" w:h="16838"/>
+          <w:pgMar w:top="0" w:right="0" w:bottom="0" w:left="0" w:header="0" w:footer="0" w:gutter="0"/>
+          <w:cols w:space="720"/>
+          <w:docGrid w:linePitch="360"/>
+        </w:sectPr>
+      </w:pPr>
+    </w:p>
+    <w:p>
+      <w:pPr>
+        <w:spacing w:after="0" w:before="0"/>
+      </w:pPr>
+      <w:r>
+        <w:drawing>
+          <wp:inline xmlns:a="http://schemas.openxmlformats.org/drawingml/2006/main" xmlns:pic="http://schemas.openxmlformats.org/drawingml/2006/picture">
+            <wp:extent cx="7524000" cy="10656000"/>
+            <wp:docPr id="22" name="Picture 22"/>
+            <wp:cNvGraphicFramePr>
+              <a:graphicFrameLocks noChangeAspect="1"/>
+            </wp:cNvGraphicFramePr>
+            <a:graphic>
+              <a:graphicData uri="http://schemas.openxmlformats.org/drawingml/2006/picture">
+                <pic:pic>
+                  <pic:nvPicPr>
+                    <pic:cNvPr id="0" name="trafik-22-binalar-3.jpg"/>
+                    <pic:cNvPicPr/>
+                  </pic:nvPicPr>
+                  <pic:blipFill>
+                    <a:blip r:embed="rId30"/>
+                    <a:stretch>
+                      <a:fillRect/>
+                    </a:stretch>
+                  </pic:blipFill>
+                  <pic:spPr>
+                    <a:xfrm>
+                      <a:off x="0" y="0"/>
+                      <a:ext cx="7524000" cy="10656000"/>
+                    </a:xfrm>
+                    <a:prstGeom prst="rect"/>
+                  </pic:spPr>
+                </pic:pic>
+              </a:graphicData>
+            </a:graphic>
+          </wp:inline>
+        </w:drawing>
+      </w:r>
+    </w:p>
+    <w:p>
+      <w:pPr>
+        <w:sectPr>
+          <w:pgSz w:w="11906" w:h="16838"/>
+          <w:pgMar w:top="0" w:right="0" w:bottom="0" w:left="0" w:header="0" w:footer="0" w:gutter="0"/>
+          <w:cols w:space="720"/>
+          <w:docGrid w:linePitch="360"/>
+        </w:sectPr>
+      </w:pPr>
+    </w:p>
+    <w:p>
+      <w:pPr>
+        <w:spacing w:after="0" w:before="0"/>
+      </w:pPr>
+      <w:r>
+        <w:drawing>
+          <wp:inline xmlns:a="http://schemas.openxmlformats.org/drawingml/2006/main" xmlns:pic="http://schemas.openxmlformats.org/drawingml/2006/picture">
+            <wp:extent cx="7524000" cy="10656000"/>
+            <wp:docPr id="23" name="Picture 23"/>
+            <wp:cNvGraphicFramePr>
+              <a:graphicFrameLocks noChangeAspect="1"/>
+            </wp:cNvGraphicFramePr>
+            <a:graphic>
+              <a:graphicData uri="http://schemas.openxmlformats.org/drawingml/2006/picture">
+                <pic:pic>
+                  <pic:nvPicPr>
+                    <pic:cNvPr id="0" name="trafik-23-tasitlar.jpg"/>
+                    <pic:cNvPicPr/>
+                  </pic:nvPicPr>
+                  <pic:blipFill>
+                    <a:blip r:embed="rId31"/>
+                    <a:stretch>
+                      <a:fillRect/>
+                    </a:stretch>
+                  </pic:blipFill>
+                  <pic:spPr>
+                    <a:xfrm>
+                      <a:off x="0" y="0"/>
+                      <a:ext cx="7524000" cy="10656000"/>
+                    </a:xfrm>
+                    <a:prstGeom prst="rect"/>
+                  </pic:spPr>
+                </pic:pic>
+              </a:graphicData>
+            </a:graphic>
+          </wp:inline>
+        </w:drawing>
+      </w:r>
+    </w:p>
     <w:sectPr>
       <w:pgSz w:w="11906" w:h="16838"/>
       <w:pgMar w:top="0" w:right="0" w:bottom="0" w:left="0" w:header="0" w:footer="0" w:gutter="0"/>

</xml_diff>